<commit_message>
projects and work experience functionality
</commit_message>
<xml_diff>
--- a/public/template_formatted.docx
+++ b/public/template_formatted.docx
@@ -15,11 +15,37 @@
         <w:jc w:val="center"/>
       </w:pPr>
       <w:r>
-        <w:t>{PhoneNumber} {Email} {LinkedIn} {Github}</w:t>
+        <w:t>{</w:t>
+      </w:r>
+      <w:proofErr w:type="spellStart"/>
+      <w:r>
+        <w:t>PhoneNumber</w:t>
+      </w:r>
+      <w:proofErr w:type="spellEnd"/>
+      <w:r>
+        <w:t>} {Email} {LinkedIn} {</w:t>
+      </w:r>
+      <w:proofErr w:type="spellStart"/>
+      <w:r>
+        <w:t>Github</w:t>
+      </w:r>
+      <w:proofErr w:type="spellEnd"/>
+      <w:r>
+        <w:t>}</w:t>
       </w:r>
     </w:p>
     <w:p>
-      <w:r>
+      <w:pPr>
+        <w:rPr>
+          <w:b/>
+          <w:bCs/>
+        </w:rPr>
+      </w:pPr>
+      <w:r>
+        <w:rPr>
+          <w:b/>
+          <w:bCs/>
+        </w:rPr>
         <w:t>Education</w:t>
       </w:r>
     </w:p>
@@ -30,7 +56,13 @@
     </w:p>
     <w:p>
       <w:r>
-        <w:t>{Degree} GPA:{GPA}</w:t>
+        <w:t>{Degree} GPA:</w:t>
+      </w:r>
+      <w:r>
+        <w:t xml:space="preserve"> </w:t>
+      </w:r>
+      <w:r>
+        <w:t>{GPA}</w:t>
       </w:r>
     </w:p>
     <w:p>
@@ -42,12 +74,30 @@
         </w:numPr>
       </w:pPr>
       <w:r>
-        <w:t>Relevant Coursework: {Classes}</w:t>
+        <w:t xml:space="preserve">Relevant </w:t>
+      </w:r>
+      <w:proofErr w:type="gramStart"/>
+      <w:r>
+        <w:t>Coursework: {</w:t>
+      </w:r>
+      <w:proofErr w:type="gramEnd"/>
+      <w:r>
+        <w:t>Classes}</w:t>
       </w:r>
     </w:p>
     <w:p/>
     <w:p>
-      <w:r>
+      <w:pPr>
+        <w:rPr>
+          <w:b/>
+          <w:bCs/>
+        </w:rPr>
+      </w:pPr>
+      <w:r>
+        <w:rPr>
+          <w:b/>
+          <w:bCs/>
+        </w:rPr>
         <w:t>Experience</w:t>
       </w:r>
     </w:p>
@@ -58,7 +108,17 @@
     </w:p>
     <w:p/>
     <w:p>
-      <w:r>
+      <w:pPr>
+        <w:rPr>
+          <w:b/>
+          <w:bCs/>
+        </w:rPr>
+      </w:pPr>
+      <w:r>
+        <w:rPr>
+          <w:b/>
+          <w:bCs/>
+        </w:rPr>
         <w:t>Projects</w:t>
       </w:r>
     </w:p>
@@ -69,29 +129,56 @@
     </w:p>
     <w:p/>
     <w:p>
-      <w:r>
+      <w:pPr>
+        <w:rPr>
+          <w:b/>
+          <w:bCs/>
+        </w:rPr>
+      </w:pPr>
+      <w:r>
+        <w:rPr>
+          <w:b/>
+          <w:bCs/>
+        </w:rPr>
         <w:t>Technical Skills</w:t>
       </w:r>
     </w:p>
     <w:p>
-      <w:r>
-        <w:t>Languages: {Languages}</w:t>
+      <w:proofErr w:type="gramStart"/>
+      <w:r>
+        <w:t>Languages: {</w:t>
+      </w:r>
+      <w:proofErr w:type="gramEnd"/>
+      <w:r>
+        <w:t>Languages}</w:t>
       </w:r>
     </w:p>
     <w:p>
       <w:r>
-        <w:t>Developer Tools: {</w:t>
-      </w:r>
+        <w:t xml:space="preserve">Developer </w:t>
+      </w:r>
+      <w:proofErr w:type="gramStart"/>
+      <w:r>
+        <w:t>Tools: {</w:t>
+      </w:r>
+      <w:proofErr w:type="spellStart"/>
+      <w:proofErr w:type="gramEnd"/>
       <w:r>
         <w:t>DeveloperTools</w:t>
       </w:r>
+      <w:proofErr w:type="spellEnd"/>
       <w:r>
         <w:t>}</w:t>
       </w:r>
     </w:p>
     <w:p>
-      <w:r>
-        <w:t>Concepts: {Concepts}</w:t>
+      <w:proofErr w:type="gramStart"/>
+      <w:r>
+        <w:t>Concepts: {</w:t>
+      </w:r>
+      <w:proofErr w:type="gramEnd"/>
+      <w:r>
+        <w:t>Concepts}</w:t>
       </w:r>
     </w:p>
     <w:sectPr>

</xml_diff>